<commit_message>
docs: update repository URL to https://github.com/Russel-git/smartsakaydagupan
</commit_message>
<xml_diff>
--- a/Checkpoint_02_SmartSakay_Dagupan.docx
+++ b/Checkpoint_02_SmartSakay_Dagupan.docx
@@ -643,7 +643,7 @@
                 <w:sz w:val="19"/>
                 <w:szCs w:val="19"/>
               </w:rPr>
-              <w:t xml:space="preserve">https://github.com/smartsakaydagupan/smartsakay-dagupan</w:t>
+              <w:t xml:space="preserve">https://github.com/Russel-git/smartsakaydagupan</w:t>
             </w:r>
           </w:p>
         </w:tc>
@@ -12278,7 +12278,7 @@
                 <w:sz w:val="19"/>
                 <w:szCs w:val="19"/>
               </w:rPr>
-              <w:t xml:space="preserve">https://github.com/smartsakaydagupan/smartsakay-dagupan</w:t>
+              <w:t xml:space="preserve">https://github.com/Russel-git/smartsakaydagupan</w:t>
             </w:r>
           </w:p>
         </w:tc>

</xml_diff>

<commit_message>
feat: add commuter mobile web public tunnel and update submission docs
</commit_message>
<xml_diff>
--- a/Checkpoint_02_SmartSakay_Dagupan.docx
+++ b/Checkpoint_02_SmartSakay_Dagupan.docx
@@ -497,7 +497,24 @@
                 <w:sz w:val="19"/>
                 <w:szCs w:val="19"/>
               </w:rPr>
-              <w:t xml:space="preserve">https://samples-mortgage-val-interests.trycloudflare.com</w:t>
+              <w:t xml:space="preserve">Admin: https://samples-mortgage-val-interests.trycloudflare.com</w:t>
+            </w:r>
+          </w:p>
+          <w:p>
+            <w:pPr>
+              <w:spacing w:after="60"/>
+              <w:jc w:val="left"/>
+            </w:pPr>
+            <w:r>
+              <w:rPr>
+                <w:rFonts w:ascii="Arial" w:cs="Arial" w:eastAsia="Arial" w:hAnsi="Arial"/>
+                <w:b w:val="false"/>
+                <w:bCs w:val="false"/>
+                <w:color w:val="0F172A"/>
+                <w:sz w:val="19"/>
+                <w:szCs w:val="19"/>
+              </w:rPr>
+              <w:t xml:space="preserve">Commuter Web: https://infectious-huntington-fourth-citation.trycloudflare.com</w:t>
             </w:r>
           </w:p>
           <w:p>
@@ -12334,24 +12351,41 @@
                 <w:sz w:val="19"/>
                 <w:szCs w:val="19"/>
               </w:rPr>
-              <w:t xml:space="preserve">https://samples-mortgage-val-interests.trycloudflare.com</w:t>
-            </w:r>
-          </w:p>
-          <w:p>
-            <w:pPr>
-              <w:spacing w:after="60"/>
-              <w:jc w:val="left"/>
-            </w:pPr>
-            <w:r>
-              <w:rPr>
-                <w:rFonts w:ascii="Arial" w:cs="Arial" w:eastAsia="Arial" w:hAnsi="Arial"/>
-                <w:b w:val="false"/>
-                <w:bCs w:val="false"/>
-                <w:color w:val="0F172A"/>
-                <w:sz w:val="19"/>
-                <w:szCs w:val="19"/>
-              </w:rPr>
-              <w:t xml:space="preserve">(Local: http://localhost:3001)</w:t>
+              <w:t xml:space="preserve">Admin: https://samples-mortgage-val-interests.trycloudflare.com</w:t>
+            </w:r>
+          </w:p>
+          <w:p>
+            <w:pPr>
+              <w:spacing w:after="60"/>
+              <w:jc w:val="left"/>
+            </w:pPr>
+            <w:r>
+              <w:rPr>
+                <w:rFonts w:ascii="Arial" w:cs="Arial" w:eastAsia="Arial" w:hAnsi="Arial"/>
+                <w:b w:val="false"/>
+                <w:bCs w:val="false"/>
+                <w:color w:val="0F172A"/>
+                <w:sz w:val="19"/>
+                <w:szCs w:val="19"/>
+              </w:rPr>
+              <w:t xml:space="preserve">Commuter Web: https://infectious-huntington-fourth-citation.trycloudflare.com</w:t>
+            </w:r>
+          </w:p>
+          <w:p>
+            <w:pPr>
+              <w:spacing w:after="60"/>
+              <w:jc w:val="left"/>
+            </w:pPr>
+            <w:r>
+              <w:rPr>
+                <w:rFonts w:ascii="Arial" w:cs="Arial" w:eastAsia="Arial" w:hAnsi="Arial"/>
+                <w:b w:val="false"/>
+                <w:bCs w:val="false"/>
+                <w:color w:val="0F172A"/>
+                <w:sz w:val="19"/>
+                <w:szCs w:val="19"/>
+              </w:rPr>
+              <w:t xml:space="preserve">(Local: http://localhost:3001 &amp; http://localhost:8081)</w:t>
             </w:r>
           </w:p>
         </w:tc>

</xml_diff>

<commit_message>
docs: add SmartSakay MERN Architecture Diagram image and embed in submission docs
</commit_message>
<xml_diff>
--- a/Checkpoint_02_SmartSakay_Dagupan.docx
+++ b/Checkpoint_02_SmartSakay_Dagupan.docx
@@ -1790,6 +1790,69 @@
         </w:tc>
       </w:tr>
     </w:tbl>
+    <w:p>
+      <w:pPr>
+        <w:pStyle w:val="Heading2"/>
+        <w:spacing w:after="120" w:before="240"/>
+        <w:rPr>
+          <w:rFonts w:ascii="Arial" w:cs="Arial" w:eastAsia="Arial" w:hAnsi="Arial"/>
+          <w:b/>
+          <w:bCs/>
+          <w:color w:val="0F172A"/>
+          <w:sz w:val="24"/>
+          <w:szCs w:val="24"/>
+        </w:rPr>
+      </w:pPr>
+      <w:r>
+        <w:t xml:space="preserve">MERN Architecture Diagram</w:t>
+      </w:r>
+    </w:p>
+    <w:p>
+      <w:pPr>
+        <w:spacing w:after="200" w:before="140"/>
+        <w:jc w:val="center"/>
+      </w:pPr>
+      <w:r>
+        <w:drawing>
+          <wp:inline distT="0" distB="0" distL="0" distR="0">
+            <wp:extent cx="5524500" cy="3105150"/>
+            <wp:effectExtent t="0" r="0" b="0" l="0"/>
+            <wp:docPr id="1" name="" descr="" title=""/>
+            <wp:cNvGraphicFramePr>
+              <a:graphicFrameLocks xmlns:a="http://schemas.openxmlformats.org/drawingml/2006/main" noChangeAspect="1"/>
+            </wp:cNvGraphicFramePr>
+            <a:graphic xmlns:a="http://schemas.openxmlformats.org/drawingml/2006/main">
+              <a:graphicData uri="http://schemas.openxmlformats.org/drawingml/2006/picture">
+                <pic:pic xmlns:pic="http://schemas.openxmlformats.org/drawingml/2006/picture">
+                  <pic:nvPicPr>
+                    <pic:cNvPr id="0" name="" descr=""/>
+                    <pic:cNvPicPr>
+                      <a:picLocks noChangeAspect="1" noChangeArrowheads="1"/>
+                    </pic:cNvPicPr>
+                  </pic:nvPicPr>
+                  <pic:blipFill>
+                    <a:blip r:embed="rId7" cstate="none"/>
+                    <a:srcRect/>
+                    <a:stretch>
+                      <a:fillRect/>
+                    </a:stretch>
+                  </pic:blipFill>
+                  <pic:spPr bwMode="auto">
+                    <a:xfrm>
+                      <a:off x="0" y="0"/>
+                      <a:ext cx="5524500" cy="3105150"/>
+                    </a:xfrm>
+                    <a:prstGeom prst="rect">
+                      <a:avLst/>
+                    </a:prstGeom>
+                  </pic:spPr>
+                </pic:pic>
+              </a:graphicData>
+            </a:graphic>
+          </wp:inline>
+        </w:drawing>
+      </w:r>
+    </w:p>
     <w:p>
       <w:pPr>
         <w:pStyle w:val="Heading2"/>

</xml_diff>